<commit_message>
fix legolize su rasp
</commit_message>
<xml_diff>
--- a/Docs/Lego Mario Mind.docx
+++ b/Docs/Lego Mario Mind.docx
@@ -440,7 +440,7 @@
           <w:lang w:eastAsia="it-IT"/>
         </w:rPr>
         <w:pict w14:anchorId="1B10ACCA">
-          <v:rect id="_x0000_i1038" style="width:0;height:1.5pt" o:hralign="center" o:hrstd="t" o:hr="t" fillcolor="#a0a0a0" stroked="f"/>
+          <v:rect id="_x0000_i1025" style="width:0;height:1.5pt" o:hralign="center" o:hrstd="t" o:hr="t" fillcolor="#a0a0a0" stroked="f"/>
         </w:pict>
       </w:r>
     </w:p>
@@ -714,15 +714,6 @@
           <w:szCs w:val="28"/>
           <w:lang w:eastAsia="it-IT"/>
         </w:rPr>
-        <w:t>.</w:t>
-      </w:r>
-      <w:r>
-        <w:rPr>
-          <w:noProof/>
-          <w:sz w:val="28"/>
-          <w:szCs w:val="28"/>
-          <w:lang w:eastAsia="it-IT"/>
-        </w:rPr>
         <w:br/>
       </w:r>
     </w:p>
@@ -743,7 +734,7 @@
           <w:lang w:eastAsia="it-IT"/>
         </w:rPr>
         <w:pict w14:anchorId="2ED747D3">
-          <v:rect id="_x0000_i1034" style="width:0;height:1.5pt" o:hralign="center" o:hrstd="t" o:hr="t" fillcolor="#a0a0a0" stroked="f"/>
+          <v:rect id="_x0000_i1027" style="width:0;height:1.5pt" o:hralign="center" o:hrstd="t" o:hr="t" fillcolor="#a0a0a0" stroked="f"/>
         </w:pict>
       </w:r>
     </w:p>
@@ -756,6 +747,75 @@
           <w:lang w:eastAsia="it-IT"/>
         </w:rPr>
       </w:pPr>
+      <w:r>
+        <w:rPr>
+          <w:rFonts w:ascii="Segoe UI Emoji" w:hAnsi="Segoe UI Emoji" w:cs="Segoe UI Emoji"/>
+          <w:noProof/>
+          <w:sz w:val="28"/>
+          <w:szCs w:val="28"/>
+          <w:lang w:eastAsia="it-IT"/>
+        </w:rPr>
+        <w:t>🙋</w:t>
+      </w:r>
+      <w:r>
+        <w:rPr>
+          <w:noProof/>
+          <w:sz w:val="28"/>
+          <w:szCs w:val="28"/>
+          <w:lang w:eastAsia="it-IT"/>
+        </w:rPr>
+        <w:t xml:space="preserve"> </w:t>
+      </w:r>
+      <w:r>
+        <w:rPr>
+          <w:b/>
+          <w:bCs/>
+          <w:noProof/>
+          <w:sz w:val="28"/>
+          <w:szCs w:val="28"/>
+          <w:lang w:eastAsia="it-IT"/>
+        </w:rPr>
+        <w:t>Vuoi provare?</w:t>
+      </w:r>
+      <w:r>
+        <w:rPr>
+          <w:noProof/>
+          <w:sz w:val="28"/>
+          <w:szCs w:val="28"/>
+          <w:lang w:eastAsia="it-IT"/>
+        </w:rPr>
+        <w:br/>
+        <w:t>Alza la mano e ti faremo giocare!</w:t>
+      </w:r>
+      <w:r>
+        <w:rPr>
+          <w:noProof/>
+          <w:sz w:val="28"/>
+          <w:szCs w:val="28"/>
+          <w:lang w:eastAsia="it-IT"/>
+        </w:rPr>
+        <w:br/>
+      </w:r>
+      <w:r>
+        <w:rPr>
+          <w:noProof/>
+          <w:sz w:val="28"/>
+          <w:szCs w:val="28"/>
+          <w:lang w:eastAsia="it-IT"/>
+        </w:rPr>
+        <w:br/>
+      </w:r>
+      <w:r>
+        <w:rPr>
+          <w:noProof/>
+          <w:sz w:val="28"/>
+          <w:szCs w:val="28"/>
+          <w:lang w:eastAsia="it-IT"/>
+        </w:rPr>
+        <w:pict w14:anchorId="183C9426">
+          <v:rect id="_x0000_i1028" style="width:0;height:1.5pt" o:hralign="center" o:hrstd="t" o:hr="t" fillcolor="#a0a0a0" stroked="f"/>
+        </w:pict>
+      </w:r>
       <w:r>
         <w:rPr>
           <w:noProof/>

</xml_diff>